<commit_message>
Update resume: Principal Frontend Engineer edition
- Replace the served PDF with the latest exported resume
- Summary retitled to Principal Frontend Engineer; Mercor role retitled
  to Senior Frontend Engineer, AI Training & Evaluations
- Trim the skills list to core items
- Sync the Markdown source, build-script content model, and regenerated
  DOCX to match

Co-Authored-By: Claude Opus 4.8 <noreply@anthropic.com>
Claude-Session: https://claude.ai/code/session_015g9FhRtJDy4HJPMenmTXDa
</commit_message>
<xml_diff>
--- a/public/resume/Rich-Tillman-Resume.docx
+++ b/public/resume/Rich-Tillman-Resume.docx
@@ -50,7 +50,7 @@
         <w:rPr>
           <w:sz w:val="21"/>
         </w:rPr>
-        <w:t>Senior AI Engineer (15 yrs) specializing in React/TypeScript design systems and Storybook-driven development. Founder of ForgeKit, an open-source Figma-to-React CLI + MCP suite (5,700+ npm installs). IC-to-Director experience across five 0-to-1 startups. Seeking Principal/Senior Frontend, Product Engineer, and design-systems/dev-tooling roles.</w:t>
+        <w:t>Principal Frontend Engineer (15 yrs) specializing in React/TypeScript design systems and Storybook-driven development. Founder of ForgeKit, an open-source Figma-to-React CLI + MCP suite (5,700+ npm installs). IC-to-Director experience across five 0-to-1 startups. Seeking Principal/Senior Frontend, Product Engineer, and design-systems/dev-tooling roles.</w:t>
       </w:r>
     </w:p>
     <w:p>
@@ -77,7 +77,7 @@
           <w:b/>
           <w:sz w:val="22"/>
         </w:rPr>
-        <w:t>Senior AI Engineer, AI Training &amp; Evaluations</w:t>
+        <w:t>Senior Frontend Engineer, AI Training &amp; Evaluations</w:t>
       </w:r>
     </w:p>
     <w:p>
@@ -844,7 +844,7 @@
         <w:rPr>
           <w:sz w:val="21"/>
         </w:rPr>
-        <w:t>React 19, TypeScript (strict), Next.js, React Native, Expo, TanStack Start, React Hooks, Concurrent Rendering, Component-Driven Architecture, Performance Optimization, HTML5, CSS3, Responsive Design, REST &amp; GraphQL Integration, Storybook 10+, Chromatic, Chakra UI, shadcn/ui, Tamagui, Ark UI, Radix UI, Styled Components / CSS-in-JS, Model Context Protocol, Claude Code, Cursor, Lovable, Figma Code Connect, Figma MCP, Nx, Nx Agents, Turborepo, pnpm workspaces, Module Federation, GitHub Actions, EAS Build, TanStack Query, Zustand, Supabase, PostgreSQL, tRPC, gRPC, Redux Toolkit, Context API, Vitest, Jest, Playwright, React Testing Library, Storybook a11y, WCAG 2.1 AA, OpenAI, Agentic Systems, CLI</w:t>
+        <w:t>React 19, TypeScript, Next.js, Node.js, React Native, Expo, TanStack Start, React Hooks, Performance Optimization, HTML5, CSS3, Responsive Design, REST &amp; GraphQL Integration, Storybook, Chromatic, Chakra UI, shadcn/ui, Tamagui, Radix UI, Styled Components / CSS-in-JS, Model Context Protocol, Claude Code, Cursor, Lovable, Figma Code Connect, Figma MCP, Nx, Turborepo, Module Federation, GitHub Actions, TanStack Query, Zustand, Supabase, PostgreSQL, tRPC, Redux Toolkit, Vitest, Jest, Playwright, React Testing Library, a11y, WCAG 2.1 AA, OpenAI, Agentic Systems</w:t>
       </w:r>
     </w:p>
     <w:sectPr>

</xml_diff>

<commit_message>
Update resume: Principal Frontend Engineer edition (#21)
- Replace the served PDF with the latest exported resume
- Summary retitled to Principal Frontend Engineer; Mercor role retitled
  to Senior Frontend Engineer, AI Training & Evaluations
- Trim the skills list to core items
- Sync the Markdown source, build-script content model, and regenerated
  DOCX to match


Claude-Session: https://claude.ai/code/session_015g9FhRtJDy4HJPMenmTXDa

Co-authored-by: Claude <noreply@anthropic.com>
</commit_message>
<xml_diff>
--- a/public/resume/Rich-Tillman-Resume.docx
+++ b/public/resume/Rich-Tillman-Resume.docx
@@ -50,7 +50,7 @@
         <w:rPr>
           <w:sz w:val="21"/>
         </w:rPr>
-        <w:t>Senior AI Engineer (15 yrs) specializing in React/TypeScript design systems and Storybook-driven development. Founder of ForgeKit, an open-source Figma-to-React CLI + MCP suite (5,700+ npm installs). IC-to-Director experience across five 0-to-1 startups. Seeking Principal/Senior Frontend, Product Engineer, and design-systems/dev-tooling roles.</w:t>
+        <w:t>Principal Frontend Engineer (15 yrs) specializing in React/TypeScript design systems and Storybook-driven development. Founder of ForgeKit, an open-source Figma-to-React CLI + MCP suite (5,700+ npm installs). IC-to-Director experience across five 0-to-1 startups. Seeking Principal/Senior Frontend, Product Engineer, and design-systems/dev-tooling roles.</w:t>
       </w:r>
     </w:p>
     <w:p>
@@ -77,7 +77,7 @@
           <w:b/>
           <w:sz w:val="22"/>
         </w:rPr>
-        <w:t>Senior AI Engineer, AI Training &amp; Evaluations</w:t>
+        <w:t>Senior Frontend Engineer, AI Training &amp; Evaluations</w:t>
       </w:r>
     </w:p>
     <w:p>
@@ -844,7 +844,7 @@
         <w:rPr>
           <w:sz w:val="21"/>
         </w:rPr>
-        <w:t>React 19, TypeScript (strict), Next.js, React Native, Expo, TanStack Start, React Hooks, Concurrent Rendering, Component-Driven Architecture, Performance Optimization, HTML5, CSS3, Responsive Design, REST &amp; GraphQL Integration, Storybook 10+, Chromatic, Chakra UI, shadcn/ui, Tamagui, Ark UI, Radix UI, Styled Components / CSS-in-JS, Model Context Protocol, Claude Code, Cursor, Lovable, Figma Code Connect, Figma MCP, Nx, Nx Agents, Turborepo, pnpm workspaces, Module Federation, GitHub Actions, EAS Build, TanStack Query, Zustand, Supabase, PostgreSQL, tRPC, gRPC, Redux Toolkit, Context API, Vitest, Jest, Playwright, React Testing Library, Storybook a11y, WCAG 2.1 AA, OpenAI, Agentic Systems, CLI</w:t>
+        <w:t>React 19, TypeScript, Next.js, Node.js, React Native, Expo, TanStack Start, React Hooks, Performance Optimization, HTML5, CSS3, Responsive Design, REST &amp; GraphQL Integration, Storybook, Chromatic, Chakra UI, shadcn/ui, Tamagui, Radix UI, Styled Components / CSS-in-JS, Model Context Protocol, Claude Code, Cursor, Lovable, Figma Code Connect, Figma MCP, Nx, Turborepo, Module Federation, GitHub Actions, TanStack Query, Zustand, Supabase, PostgreSQL, tRPC, Redux Toolkit, Vitest, Jest, Playwright, React Testing Library, a11y, WCAG 2.1 AA, OpenAI, Agentic Systems</w:t>
       </w:r>
     </w:p>
     <w:sectPr>

</xml_diff>

<commit_message>
fix(resume): correct install attribution in build script + regenerate DOCX/PDF
Addresses Copilot review on #36 — the résumé build script still hard-coded
the old 'CLI + MCP suite (5,700+ npm installs)' wording, so the generated
DOCX/PDF contradicted the corrected Markdown. Updated the script's summary
and ForgeKit project subtitle to attribute installs to forgekit-storybook-mcp,
and regenerated both binaries.

Co-Authored-By: Claude Opus 4.8 <noreply@anthropic.com>
Claude-Session: https://claude.ai/code/session_019kDs8aS7et2wEp37VuUJL4
</commit_message>
<xml_diff>
--- a/public/resume/Rich-Tillman-Resume.docx
+++ b/public/resume/Rich-Tillman-Resume.docx
@@ -50,7 +50,7 @@
         <w:rPr>
           <w:sz w:val="21"/>
         </w:rPr>
-        <w:t>Principal Frontend Engineer (15 yrs) specializing in React/TypeScript design systems and Storybook-driven development. Founder of ForgeKit, an open-source Figma-to-React CLI + MCP suite (5,700+ npm installs). IC-to-Director experience across five 0-to-1 startups. Seeking Principal/Senior Frontend, Product Engineer, and design-systems/dev-tooling roles.</w:t>
+        <w:t>Principal Frontend Engineer (15 yrs) specializing in React/TypeScript design systems and Storybook-driven development. Founder of ForgeKit — open-source Figma/Storybook → React dev tooling; its Storybook MCP server (forgekit-storybook-mcp) has 6,900+ npm installs. IC-to-Director experience across five 0-to-1 startups. Seeking Principal/Senior Frontend, Product Engineer, and design-systems/dev-tooling roles.</w:t>
       </w:r>
     </w:p>
     <w:p>
@@ -749,7 +749,7 @@
           <w:i/>
           <w:sz w:val="20"/>
         </w:rPr>
-        <w:t>Open-source Figma-to-React CLI + MCP suite (5,700+ npm installs)</w:t>
+        <w:t>Open-source Figma/Storybook → React dev tooling; Storybook MCP server (forgekit-storybook-mcp) at 6,900+ npm installs</w:t>
       </w:r>
       <w:r>
         <w:tab/>

</xml_diff>